<commit_message>
fix: map auto-zoom, TTS headless, design doc sync
Fixes:
- Map: compute bounds from node lat/lng data directly (not layer-dependent)
- TTS: readCurrentContent now includes node name + time before content
- Design doc: append V1.0.1 changelog with 星火 implementation items
- All previous fixes (popup panels, title spacing) already committed
</commit_message>
<xml_diff>
--- a/000 脚本策划/重走长征路_弘扬长征精神设计方案_V1.0.0.docx
+++ b/000 脚本策划/重走长征路_弘扬长征精神设计方案_V1.0.0.docx
@@ -9841,6 +9841,115 @@
       </w:r>
       <w:r>
         <w:t>- 留言板后端接口</w:t>
+      </w:r>
+    </w:p>
+    <w:p>
+      <w:r>
+        <w:rPr/>
+        <w:t xml:space="preserve"/>
+      </w:r>
+    </w:p>
+    <w:p>
+      <w:pPr>
+        <w:spacing w:before="200"/>
+      </w:pPr>
+      <w:r>
+        <w:rPr>
+          <w:b>
+            <w:val w:val="true"/>
+          </w:b>
+        </w:rPr>
+        <w:t xml:space="preserve">V1.0.1（2026-07-15，代码实现更新）：</w:t>
+      </w:r>
+    </w:p>
+    <w:p>
+      <w:r>
+        <w:rPr/>
+        <w:t xml:space="preserve">1. 新增：星火拾遗完整对话框（新建节点+补充既有节点两种模式）</w:t>
+      </w:r>
+    </w:p>
+    <w:p>
+      <w:r>
+        <w:rPr/>
+        <w:t xml:space="preserve">2. 新增：全字段表单（标题、地点、经纬度、时间、战役、会议等所有节点域）</w:t>
+      </w:r>
+    </w:p>
+    <w:p>
+      <w:r>
+        <w:rPr/>
+        <w:t xml:space="preserve">3. 新增：文件上传（图片多选、视频、音频、文档）</w:t>
+      </w:r>
+    </w:p>
+    <w:p>
+      <w:r>
+        <w:rPr/>
+        <w:t xml:space="preserve">4. 新增：POST /api/v1/sparks/full 后端API，提交至待审核</w:t>
+      </w:r>
+    </w:p>
+    <w:p>
+      <w:r>
+        <w:rPr/>
+        <w:t xml:space="preserve">5. 修复：地图自动缩放至全路线范围（结合节点+路线双边界）</w:t>
+      </w:r>
+    </w:p>
+    <w:p>
+      <w:r>
+        <w:rPr/>
+        <w:t xml:space="preserve">6. 修复：控制栏弹出面板不显示（移除style=display:none）</w:t>
+      </w:r>
+    </w:p>
+    <w:p>
+      <w:r>
+        <w:rPr/>
+        <w:t xml:space="preserve">7. 修复：TTS朗读包含节点名称和时间</w:t>
+      </w:r>
+    </w:p>
+    <w:p>
+      <w:r>
+        <w:rPr/>
+        <w:t xml:space="preserve">8. 优化：标题添加空格间距适配窄屏</w:t>
+      </w:r>
+    </w:p>
+    <w:p>
+      <w:r>
+        <w:rPr/>
+        <w:t xml:space="preserve">9. 更新：新增 spark.js 模块管理星火表单和提交逻辑</w:t>
+      </w:r>
+    </w:p>
+    <w:p>
+      <w:r>
+        <w:rPr/>
+        <w:t xml:space="preserve"/>
+      </w:r>
+    </w:p>
+    <w:p>
+      <w:r>
+        <w:rPr/>
+        <w:t xml:space="preserve">待实现（V1.1+）：</w:t>
+      </w:r>
+    </w:p>
+    <w:p>
+      <w:r>
+        <w:rPr/>
+        <w:t xml:space="preserve">- 审核后台：管理员逐项审核节点每个域（字段级控制）</w:t>
+      </w:r>
+    </w:p>
+    <w:p>
+      <w:r>
+        <w:rPr/>
+        <w:t xml:space="preserve">- 审核通过自动合并到既有节点或创建新节点</w:t>
+      </w:r>
+    </w:p>
+    <w:p>
+      <w:r>
+        <w:rPr/>
+        <w:t xml:space="preserve">- 多军路线（红二/四方面军、红25军）</w:t>
+      </w:r>
+    </w:p>
+    <w:p>
+      <w:r>
+        <w:rPr/>
+        <w:t xml:space="preserve">- 用户创建节点→审核→发布完整流程</w:t>
       </w:r>
     </w:p>
     <w:sectPr>

</xml_diff>